<commit_message>
Add ClearMove project URL to SWE resume
</commit_message>
<xml_diff>
--- a/resumes/swe/Ching-Wei-Kang-SWE-Resume.docx
+++ b/resumes/swe/Ching-Wei-Kang-SWE-Resume.docx
@@ -2420,6 +2420,30 @@
             </w:pPr>
             <w:r>
               <w:rPr>
+                <w:b w:val="1"/>
+                <w:bCs w:val="1"/>
+                <w:sz w:val="21"/>
+                <w:szCs w:val="21"/>
+                <w:rtl w:val="0"/>
+              </w:rPr>
+              <w:t xml:space="preserve">ClearMove — Rental Evidence Platform | </w:t>
+            </w:r>
+            <w:hyperlink r:id="rId14">
+              <w:r>
+                <w:rPr>
+                  <w:b w:val="1"/>
+                  <w:bCs w:val="1"/>
+                  <w:color w:val="1459be"/>
+                  <w:sz w:val="21"/>
+                  <w:szCs w:val="21"/>
+                  <w:u w:val="single"/>
+                  <w:rtl w:val="0"/>
+                </w:rPr>
+                <w:t xml:space="preserve">https://devpost.com/software/clearmove</w:t>
+              </w:r>
+            </w:hyperlink>
+            <w:r>
+              <w:rPr>
                 <w:rFonts w:ascii="Arial" w:cs="Arial" w:eastAsia="Arial" w:hAnsi="Arial"/>
                 <w:b w:val="1"/>
                 <w:bCs w:val="1"/>
@@ -2430,7 +2454,7 @@
                 <w:szCs w:val="21"/>
                 <w:rtl w:val="0"/>
               </w:rPr>
-              <w:t xml:space="preserve">ClearMove — Rental Evidence Platform</w:t>
+              <w:t xml:space="preserve">m</w:t>
             </w:r>
             <w:r>
               <w:rPr>

</xml_diff>

<commit_message>
Publish linked ClearMove resume update
</commit_message>
<xml_diff>
--- a/resumes/swe/Ching-Wei-Kang-SWE-Resume.docx
+++ b/resumes/swe/Ching-Wei-Kang-SWE-Resume.docx
@@ -2442,20 +2442,6 @@
                 <w:t xml:space="preserve">https://devpost.com/software/clearmove</w:t>
               </w:r>
             </w:hyperlink>
-            <w:r>
-              <w:rPr>
-                <w:rFonts w:ascii="Arial" w:cs="Arial" w:eastAsia="Arial" w:hAnsi="Arial"/>
-                <w:b w:val="1"/>
-                <w:bCs w:val="1"/>
-                <w:i w:val="0"/>
-                <w:iCs w:val="0"/>
-                <w:color w:val="000000"/>
-                <w:sz w:val="21"/>
-                <w:szCs w:val="21"/>
-                <w:rtl w:val="0"/>
-              </w:rPr>
-              <w:t xml:space="preserve">m</w:t>
-            </w:r>
             <w:r>
               <w:rPr>
                 <w:rtl w:val="0"/>

</xml_diff>